<commit_message>
Handoff plan: verified storage recommendation (SharePoint List via Graph, no server); drop em dashes
Co-Authored-By: Claude Fable 5 <noreply@anthropic.com>
Claude-Session: https://claude.ai/code/session_019MdxDfxB8wg2Ht2aZSuwqK
</commit_message>
<xml_diff>
--- a/standard-work/docs/Handoff_Plan_3D_Mezzanine_Model.docx
+++ b/standard-work/docs/Handoff_Plan_3D_Mezzanine_Model.docx
@@ -9,7 +9,7 @@
           <w:color w:val="1D3A66"/>
           <w:sz w:val="36"/>
         </w:rPr>
-        <w:t>3D Mezzanine Model — Handoff Plan to TUUCI</w:t>
+        <w:t>3D Mezzanine Model, Handoff Plan to TUUCI</w:t>
       </w:r>
     </w:p>
     <w:p>
@@ -49,7 +49,7 @@
         <w:t>3D Mezzanine Model</w:t>
       </w:r>
       <w:r>
-        <w:t xml:space="preserve"> — single-file web app of the whole mezzanine: Meritage, Sola and Canyon Crew lines animated with live takt/cycle/current-pace math, per-product standard work, editable layouts and times. Runs in any browser, no install.</w:t>
+        <w:t>: single-file web app of the whole mezzanine (Meritage, Sola, Canyon Crew) animated with live takt/cycle/current-pace math, per-product standard work, editable layouts and times. Runs in any browser, no install.</w:t>
       </w:r>
     </w:p>
     <w:p>
@@ -64,7 +64,7 @@
         <w:t>Source code</w:t>
       </w:r>
       <w:r>
-        <w:t xml:space="preserve"> — one JavaScript source file + a one-command build.</w:t>
+        <w:t>: one JavaScript source file plus a one-command build.</w:t>
       </w:r>
     </w:p>
     <w:p>
@@ -79,7 +79,7 @@
         <w:t>Data &amp; assumptions register (KNOWLEDGE.md)</w:t>
       </w:r>
       <w:r>
-        <w:t xml:space="preserve"> — every measured SWI, which numbers are measured vs estimated, and the model’s assumptions.</w:t>
+        <w:t>: every measured SWI, which numbers are measured vs estimated, and the model assumptions.</w:t>
       </w:r>
     </w:p>
     <w:p>
@@ -94,7 +94,7 @@
         <w:t>Related docs</w:t>
       </w:r>
       <w:r>
-        <w:t xml:space="preserve"> — Meritage connector ECN draft, PCN draft, improvement presentation.</w:t>
+        <w:t>: Meritage connector ECN draft, PCN draft, improvement presentation.</w:t>
       </w:r>
     </w:p>
     <w:p>
@@ -119,7 +119,7 @@
           <w:b w:val="0"/>
           <w:sz w:val="21"/>
         </w:rPr>
-        <w:t>Today the app saves to (1) the browser’s localStorage — that computer only; (2) layouts baked into each saved copy of the file — every copy becomes its own fork; (3) manual export/import files. None of these sync between people: if a supervisor rebalances a line or updates times from a new SWI, nobody else sees it. There is no single source of truth. Fine for a one-person tool; not acceptable company-wide.</w:t>
+        <w:t>Today the app saves to (1) the browser localStorage, that computer only; (2) layouts baked into each saved copy of the file, so every copy becomes its own fork; (3) manual export/import files. None of these sync between people: if a supervisor rebalances a line or updates times from a new SWI, nobody else sees it. There is no single source of truth. Fine for a one-person tool; not acceptable company-wide.</w:t>
       </w:r>
     </w:p>
     <w:p>
@@ -132,7 +132,136 @@
           <w:color w:val="1D3A66"/>
           <w:sz w:val="28"/>
         </w:rPr>
-        <w:t>3 · Where the data should live</w:t>
+        <w:t>3 · Where the data should live (verified recommendation)</w:t>
+      </w:r>
+    </w:p>
+    <w:p>
+      <w:pPr>
+        <w:spacing w:after="80"/>
+      </w:pPr>
+      <w:r>
+        <w:rPr>
+          <w:b w:val="0"/>
+          <w:sz w:val="21"/>
+        </w:rPr>
+        <w:t>The right home is the Microsoft 365 that TUUCI already pays for. No new server to host or maintain. The points below were checked against Microsoft documentation.</w:t>
+      </w:r>
+    </w:p>
+    <w:p>
+      <w:pPr>
+        <w:spacing w:after="40"/>
+      </w:pPr>
+      <w:r>
+        <w:rPr>
+          <w:b/>
+          <w:sz w:val="21"/>
+        </w:rPr>
+        <w:t>The store: a SharePoint List, one row per saved layout, on a shared SharePoint/Teams site.</w:t>
+      </w:r>
+    </w:p>
+    <w:p>
+      <w:pPr>
+        <w:spacing w:after="80"/>
+      </w:pPr>
+      <w:r>
+        <w:rPr>
+          <w:b w:val="0"/>
+          <w:sz w:val="21"/>
+        </w:rPr>
+        <w:t>The app reads and writes it through the Microsoft Graph API using each person’s normal M365 sign-in. When one person saves, everyone gets it on next load. This is the durable form of "run it on our OneDrive."</w:t>
+      </w:r>
+    </w:p>
+    <w:p>
+      <w:pPr>
+        <w:spacing w:after="40"/>
+      </w:pPr>
+      <w:r>
+        <w:rPr>
+          <w:b w:val="0"/>
+          <w:sz w:val="21"/>
+        </w:rPr>
+        <w:t>Why a List and not a single JSON file on OneDrive: a shared file is unsafe. When two people save within a few seconds, OneDrive silently keeps a conflict copy (for example layouts-MARKS-PC.json) and one person’s edits disappear from the copy everyone else is reading. A SharePoint List, through Graph, gives:</w:t>
+      </w:r>
+    </w:p>
+    <w:p>
+      <w:pPr>
+        <w:pStyle w:val="ListBullet"/>
+        <w:spacing w:after="40"/>
+      </w:pPr>
+      <w:r>
+        <w:t>collisions only when two people edit the SAME layout, not the whole dataset;</w:t>
+      </w:r>
+    </w:p>
+    <w:p>
+      <w:pPr>
+        <w:pStyle w:val="ListBullet"/>
+        <w:spacing w:after="40"/>
+      </w:pPr>
+      <w:r>
+        <w:t>optimistic concurrency: a stale save is rejected (HTTP 412) so the app re-loads and warns instead of overwriting;</w:t>
+      </w:r>
+    </w:p>
+    <w:p>
+      <w:pPr>
+        <w:pStyle w:val="ListBullet"/>
+        <w:spacing w:after="40"/>
+      </w:pPr>
+      <w:r>
+        <w:t>per-item version history: who changed what, and when, built in. This mirrors the ECN/PCN change-control habit for free.</w:t>
+      </w:r>
+    </w:p>
+    <w:p>
+      <w:pPr>
+        <w:spacing w:after="40"/>
+      </w:pPr>
+      <w:r>
+        <w:rPr>
+          <w:b w:val="0"/>
+          <w:sz w:val="21"/>
+        </w:rPr>
+        <w:t>Two things to know up front, both confirmed:</w:t>
+      </w:r>
+    </w:p>
+    <w:p>
+      <w:pPr>
+        <w:pStyle w:val="ListBullet"/>
+        <w:spacing w:after="40"/>
+      </w:pPr>
+      <w:r>
+        <w:rPr>
+          <w:b/>
+        </w:rPr>
+        <w:t>Hosting:</w:t>
+      </w:r>
+      <w:r>
+        <w:t xml:space="preserve"> The app is served from a static web address, not from the OneDrive folder. SharePoint serves a raw .html file as a download, and a double-clicked local file cannot sign in. Host the page on an internal web server, Azure Static Web Apps, or package it into SharePoint (SPFx). This is static hosting, not an application server to babysit. The data lives in M365; the app file is served from a URL.</w:t>
+      </w:r>
+    </w:p>
+    <w:p>
+      <w:pPr>
+        <w:pStyle w:val="ListBullet"/>
+        <w:spacing w:after="40"/>
+      </w:pPr>
+      <w:r>
+        <w:rPr>
+          <w:b/>
+        </w:rPr>
+        <w:t>Admin consent:</w:t>
+      </w:r>
+      <w:r>
+        <w:t xml:space="preserve"> To reach a shared location (not a user’s own OneDrive), an M365 admin grants a one-time tenant consent for the Graph permission (Sites.ReadWrite.All), plus a one-time Entra "SPA" app registration. About 15 minutes, once. After that, users just sign in.</w:t>
+      </w:r>
+    </w:p>
+    <w:p>
+      <w:pPr>
+        <w:spacing w:after="80"/>
+      </w:pPr>
+      <w:r>
+        <w:rPr>
+          <w:b w:val="0"/>
+          <w:sz w:val="21"/>
+        </w:rPr>
+        <w:t>The code is already shaped for this swap: every read and write funnels through four functions (saveLayout, loadLayout, readLayouts, writeLayouts). Replacing localStorage with MSAL sign-in plus Graph calls is roughly one to two days of development.</w:t>
       </w:r>
     </w:p>
     <w:p>
@@ -144,67 +273,7 @@
           <w:b/>
           <w:sz w:val="21"/>
         </w:rPr>
-        <w:t>Option A — Small internal server (RECOMMENDED)</w:t>
-      </w:r>
-    </w:p>
-    <w:p>
-      <w:pPr>
-        <w:spacing w:after="80"/>
-      </w:pPr>
-      <w:r>
-        <w:rPr>
-          <w:b w:val="0"/>
-          <w:sz w:val="21"/>
-        </w:rPr>
-        <w:t>App served from one company URL; layouts, products and times live server-side behind a tiny REST API (SQLite/JSON). Anyone opens the same URL; a save propagates company-wide on next load, stamped with who/what/when. The code already funnels every read/write through four functions, so the swap from localStorage is roughly a day of development plus a small IT-hosted VM/IIS site. Add roles: anyone saves sandbox layouts; only named owners publish Official ones.</w:t>
-      </w:r>
-    </w:p>
-    <w:p>
-      <w:pPr>
-        <w:spacing w:after="80"/>
-      </w:pPr>
-      <w:r>
-        <w:rPr>
-          <w:b/>
-          <w:sz w:val="21"/>
-        </w:rPr>
-        <w:t>Option B — SharePoint / Microsoft 365 native</w:t>
-      </w:r>
-    </w:p>
-    <w:p>
-      <w:pPr>
-        <w:spacing w:after="80"/>
-      </w:pPr>
-      <w:r>
-        <w:rPr>
-          <w:b w:val="0"/>
-          <w:sz w:val="21"/>
-        </w:rPr>
-        <w:t>Layout data in a SharePoint list via the Microsoft Graph API with company sign-in. No self-hosted server and auth is the existing M365 login, but needs an Azure AD app registration, more integration code, and SharePoint API limits. Choose only if IT prefers no self-hosted services.</w:t>
-      </w:r>
-    </w:p>
-    <w:p>
-      <w:pPr>
-        <w:spacing w:after="80"/>
-      </w:pPr>
-      <w:r>
-        <w:rPr>
-          <w:b/>
-          <w:sz w:val="21"/>
-        </w:rPr>
-        <w:t>Option C — Published-copy discipline (interim, zero IT effort)</w:t>
-      </w:r>
-    </w:p>
-    <w:p>
-      <w:pPr>
-        <w:spacing w:after="80"/>
-      </w:pPr>
-      <w:r>
-        <w:rPr>
-          <w:b w:val="0"/>
-          <w:sz w:val="21"/>
-        </w:rPr>
-        <w:t>One copy on SharePoint/network drive is the only official copy; one owner makes changes, uses “Save into app,” and republishes there. Works today, but sync is manual and only as strong as the discipline.</w:t>
+        <w:t>Interim bridge (this week, zero IT effort): declare one copy on the SharePoint/Teams site the only official copy. One owner makes changes, uses "Save into app," and republishes there. Everyone opens from that link, never a local copy. Manual, but it stops the forking today.</w:t>
       </w:r>
     </w:p>
     <w:p>
@@ -213,10 +282,10 @@
       </w:pPr>
       <w:r>
         <w:rPr>
-          <w:b/>
+          <w:b w:val="0"/>
           <w:sz w:val="21"/>
         </w:rPr>
-        <w:t>Recommendation: start C immediately (costs nothing), build A as the real fix.</w:t>
+        <w:t>Ownership note: put it on a SharePoint/Teams site, not a person’s personal OneDrive. Everyone still perceives it as "our OneDrive," but it does not orphan if that person leaves.</w:t>
       </w:r>
     </w:p>
     <w:p>
@@ -244,7 +313,7 @@
         <w:t>Sandbox vs Official</w:t>
       </w:r>
       <w:r>
-        <w:t xml:space="preserve"> — anyone experiments under their own name; only the named data owner overwrites Official layouts/times.</w:t>
+        <w:t>: anyone experiments under their own name; only the named data owner publishes Official layouts/times.</w:t>
       </w:r>
     </w:p>
     <w:p>
@@ -259,7 +328,7 @@
         <w:t>Times change with evidence</w:t>
       </w:r>
       <w:r>
-        <w:t xml:space="preserve"> — official step times change only when a new/revised SWI backs them; the measured-vs-estimated register updates in the same change.</w:t>
+        <w:t>: official step times change only when a new or revised SWI backs them; the measured-vs-estimated register updates in the same change.</w:t>
       </w:r>
     </w:p>
     <w:p>
@@ -274,7 +343,7 @@
         <w:t>Change log</w:t>
       </w:r>
       <w:r>
-        <w:t xml:space="preserve"> — the server records who changed what, when (Option A gives this for free).</w:t>
+        <w:t>: the SharePoint List version history records who changed what, and when, for every save.</w:t>
       </w:r>
     </w:p>
     <w:p>
@@ -373,7 +442,7 @@
           </w:tcPr>
           <w:p>
             <w:r>
-              <w:t>Decision meeting with IT: pick Option A/B; confirm hosting, auth (AD SSO?), backup</w:t>
+              <w:t>IT setup: create the SharePoint/Teams site and a "Layouts" List; register an Entra "SPA" app; admin-consent the Graph scope (Sites.ReadWrite.All)</w:t>
             </w:r>
           </w:p>
         </w:tc>
@@ -393,7 +462,7 @@
           </w:tcPr>
           <w:p>
             <w:r>
-              <w:t>30 min</w:t>
+              <w:t>~1/2 day</w:t>
             </w:r>
           </w:p>
         </w:tc>
@@ -415,7 +484,7 @@
           </w:tcPr>
           <w:p>
             <w:r>
-              <w:t>Start Option C now: publish the official copy to SharePoint; announce “open from here only”</w:t>
+              <w:t>Start the interim bridge now: publish the official copy to the site; announce "open from here only"</w:t>
             </w:r>
           </w:p>
         </w:tc>
@@ -457,7 +526,7 @@
           </w:tcPr>
           <w:p>
             <w:r>
-              <w:t>Transfer code into TUUCI’s GitHub org / IT-controlled repo with build README</w:t>
+              <w:t>Transfer code into TUUCI GitHub org / IT-controlled repo with build README</w:t>
             </w:r>
           </w:p>
         </w:tc>
@@ -477,7 +546,7 @@
           </w:tcPr>
           <w:p>
             <w:r>
-              <w:t>½ day</w:t>
+              <w:t>1/2 day</w:t>
             </w:r>
           </w:p>
         </w:tc>
@@ -499,7 +568,7 @@
           </w:tcPr>
           <w:p>
             <w:r>
-              <w:t>Implement chosen storage (Option A: tiny REST API + swap four storage functions)</w:t>
+              <w:t>Implement storage: MSAL sign-in + Graph read/write against the Layouts List (ETag concurrency); swap the four storage functions; host the page on an internal HTTPS URL</w:t>
             </w:r>
           </w:p>
         </w:tc>
@@ -519,7 +588,7 @@
           </w:tcPr>
           <w:p>
             <w:r>
-              <w:t>1–2 days</w:t>
+              <w:t>1-2 days</w:t>
             </w:r>
           </w:p>
         </w:tc>
@@ -541,7 +610,7 @@
           </w:tcPr>
           <w:p>
             <w:r>
-              <w:t>Pilot with 2–3 mezzanine users; verify saves propagate</w:t>
+              <w:t>Pilot with 2-3 mezzanine users; verify saves propagate and nothing is lost</w:t>
             </w:r>
           </w:p>
         </w:tc>
@@ -583,7 +652,7 @@
           </w:tcPr>
           <w:p>
             <w:r>
-              <w:t>Name owners: technical owner (builds/deploys) and data owner (publishes Official)</w:t>
+              <w:t>Name owners: technical owner (builds/deploys/hosts) and data owner (publishes Official)</w:t>
             </w:r>
           </w:p>
         </w:tc>
@@ -603,7 +672,7 @@
           </w:tcPr>
           <w:p>
             <w:r>
-              <w:t>—</w:t>
+              <w:t>.</w:t>
             </w:r>
           </w:p>
         </w:tc>
@@ -625,7 +694,7 @@
           </w:tcPr>
           <w:p>
             <w:r>
-              <w:t>Training: 1-hour session + one-page cheat sheet</w:t>
+              <w:t>Training: 1-hour session plus a one-page cheat sheet</w:t>
             </w:r>
           </w:p>
         </w:tc>
@@ -645,7 +714,7 @@
           </w:tcPr>
           <w:p>
             <w:r>
-              <w:t>½ day prep</w:t>
+              <w:t>1/2 day prep</w:t>
             </w:r>
           </w:p>
         </w:tc>
@@ -667,7 +736,7 @@
           </w:tcPr>
           <w:p>
             <w:r>
-              <w:t>Support path + keep assumptions register current</w:t>
+              <w:t>Support path plus keep the assumptions register current</w:t>
             </w:r>
           </w:p>
         </w:tc>
@@ -712,7 +781,7 @@
         <w:spacing w:after="40"/>
       </w:pPr>
       <w:r>
-        <w:t>Hosting: internal VM/IIS vs M365-native (drives Option A vs B)</w:t>
+        <w:t>Where to host the app page: internal web server vs Azure Static Web Apps vs SharePoint (SPFx).</w:t>
       </w:r>
     </w:p>
     <w:p>
@@ -721,7 +790,7 @@
         <w:spacing w:after="40"/>
       </w:pPr>
       <w:r>
-        <w:t>Authentication: open on the LAN vs AD sign-in with roles</w:t>
+        <w:t>Who does the one-time Entra app registration and admin consent.</w:t>
       </w:r>
     </w:p>
     <w:p>
@@ -730,7 +799,7 @@
         <w:spacing w:after="40"/>
       </w:pPr>
       <w:r>
-        <w:t>Backup/retention of the layout database</w:t>
+        <w:t>Backup/retention of the Layouts List (SharePoint version history plus recycle bin, or an extra export).</w:t>
       </w:r>
     </w:p>
     <w:p>
@@ -739,7 +808,7 @@
         <w:spacing w:after="40"/>
       </w:pPr>
       <w:r>
-        <w:t>Named technical owner and data owner</w:t>
+        <w:t>Named technical owner and data owner.</w:t>
       </w:r>
     </w:p>
     <w:sectPr>

</xml_diff>

<commit_message>
Handoff plan v2: end-state (admin vs floor-manager roles), phases, definition of done
Co-Authored-By: Claude Fable 5 <noreply@anthropic.com>
Claude-Session: https://claude.ai/code/session_019MdxDfxB8wg2Ht2aZSuwqK
</commit_message>
<xml_diff>
--- a/standard-work/docs/Handoff_Plan_3D_Mezzanine_Model.docx
+++ b/standard-work/docs/Handoff_Plan_3D_Mezzanine_Model.docx
@@ -21,7 +21,7 @@
           <w:b w:val="0"/>
           <w:sz w:val="18"/>
         </w:rPr>
-        <w:t>Prepared 07/14/2026 · Douglas O'Keefe, Continuous Improvement · DRAFT for review with Engineering + IT</w:t>
+        <w:t>Prepared 07/14/2026 · Updated 07/16/2026 · Mac O'Keefe, Continuous Improvement · DRAFT for review with Engineering + IT</w:t>
       </w:r>
     </w:p>
     <w:p>
@@ -49,7 +49,7 @@
         <w:t>3D Mezzanine Model</w:t>
       </w:r>
       <w:r>
-        <w:t>: single-file web app of the whole mezzanine (Meritage, Sola, Canyon Crew) animated with live takt/cycle/current-pace math, per-product standard work, editable layouts and times. Runs in any browser, no install.</w:t>
+        <w:t>: the whole mezzanine (Meritage, Sola, Canyon Crew) animated with live cycle/pace/capacity/bottleneck math, per-product standard work, product-specific help paths, crew coverage rules, a daily Planner, a Takt board with a help-path optimizer, and a toolbar that separates daily analysis tools from floor-editing tools. Any browser, no install. TUUCI-branded copy included.</w:t>
       </w:r>
     </w:p>
     <w:p>
@@ -64,7 +64,7 @@
         <w:t>Source code</w:t>
       </w:r>
       <w:r>
-        <w:t>: one JavaScript source file plus a one-command build.</w:t>
+        <w:t>: one JavaScript source plus a one-command build and the TUUCI theming script.</w:t>
       </w:r>
     </w:p>
     <w:p>
@@ -76,7 +76,7 @@
         <w:rPr>
           <w:b/>
         </w:rPr>
-        <w:t>Data &amp; assumptions register (KNOWLEDGE.md)</w:t>
+        <w:t>Data &amp; assumptions register</w:t>
       </w:r>
       <w:r>
         <w:t>: every measured SWI, which numbers are measured vs estimated, and the model assumptions.</w:t>
@@ -94,7 +94,7 @@
         <w:t>Related docs</w:t>
       </w:r>
       <w:r>
-        <w:t>: Meritage connector ECN draft, PCN draft, improvement presentation.</w:t>
+        <w:t>: Meritage connector ECN and PCN drafts, improvement presentation, meeting deck.</w:t>
       </w:r>
     </w:p>
     <w:p>
@@ -107,19 +107,76 @@
           <w:color w:val="1D3A66"/>
           <w:sz w:val="28"/>
         </w:rPr>
-        <w:t>2 · The data problem (why storage must change)</w:t>
+        <w:t>2 · The end state (what "handed off" means)</w:t>
       </w:r>
     </w:p>
     <w:p>
       <w:pPr>
-        <w:spacing w:after="120"/>
+        <w:spacing w:after="40"/>
       </w:pPr>
       <w:r>
         <w:rPr>
           <w:b w:val="0"/>
           <w:sz w:val="21"/>
         </w:rPr>
-        <w:t>Today the app saves to (1) the browser localStorage, that computer only; (2) layouts baked into each saved copy of the file, so every copy becomes its own fork; (3) manual export/import files. None of these sync between people: if a supervisor rebalances a line or updates times from a new SWI, nobody else sees it. There is no single source of truth. Fine for a one-person tool; not acceptable company-wide.</w:t>
+        <w:t>Two roles, one shared source of truth:</w:t>
+      </w:r>
+    </w:p>
+    <w:p>
+      <w:pPr>
+        <w:pStyle w:val="ListBullet"/>
+        <w:spacing w:after="40"/>
+      </w:pPr>
+      <w:r>
+        <w:rPr>
+          <w:b/>
+        </w:rPr>
+        <w:t>Admin page</w:t>
+      </w:r>
+      <w:r>
+        <w:t xml:space="preserve"> (Engineering/CI): the back end and workflow design. Stations, step times, products, coverage rules, floor layout, cart routes. Maps to the app’s "Floor tools" + Edit times side today.</w:t>
+      </w:r>
+    </w:p>
+    <w:p>
+      <w:pPr>
+        <w:pStyle w:val="ListBullet"/>
+        <w:spacing w:after="40"/>
+      </w:pPr>
+      <w:r>
+        <w:rPr>
+          <w:b/>
+        </w:rPr>
+        <w:t>Floor manager page</w:t>
+      </w:r>
+      <w:r>
+        <w:t xml:space="preserve"> (line supervisors, daily): what each line builds today, how many, in what order, with how many people; the tool returns the schedule, the takt picture, and the best help-path setup. Maps to the Planner + Takt board side today.</w:t>
+      </w:r>
+    </w:p>
+    <w:p>
+      <w:pPr>
+        <w:pStyle w:val="ListBullet"/>
+        <w:spacing w:after="40"/>
+      </w:pPr>
+      <w:r>
+        <w:rPr>
+          <w:b/>
+        </w:rPr>
+        <w:t>Shared data</w:t>
+      </w:r>
+      <w:r>
+        <w:t xml:space="preserve"> in TUUCI’s Microsoft 365: one person saves, everyone sees it on next load. No forked copies.</w:t>
+      </w:r>
+    </w:p>
+    <w:p>
+      <w:pPr>
+        <w:spacing w:after="80"/>
+      </w:pPr>
+      <w:r>
+        <w:rPr>
+          <w:b w:val="0"/>
+          <w:sz w:val="21"/>
+        </w:rPr>
+        <w:t>The current app already previews this split (daily tools visible, floor tools behind a toggle). The handoff makes it real with storage, permissions, and owners.</w:t>
       </w:r>
     </w:p>
     <w:p>
@@ -132,94 +189,31 @@
           <w:color w:val="1D3A66"/>
           <w:sz w:val="28"/>
         </w:rPr>
-        <w:t>3 · Where the data should live (verified recommendation)</w:t>
+        <w:t>3 · Where the data should live (verified)</w:t>
       </w:r>
     </w:p>
     <w:p>
       <w:pPr>
-        <w:spacing w:after="80"/>
+        <w:spacing w:after="60"/>
       </w:pPr>
       <w:r>
         <w:rPr>
           <w:b w:val="0"/>
           <w:sz w:val="21"/>
         </w:rPr>
-        <w:t>The right home is the Microsoft 365 that TUUCI already pays for. No new server to host or maintain. The points below were checked against Microsoft documentation.</w:t>
+        <w:t>The Microsoft 365 TUUCI already pays for; no new server. The store is a SharePoint List, one row per saved layout, on a shared SharePoint/Teams site, read and written through the Microsoft Graph API with each person’s normal M365 sign-in.</w:t>
       </w:r>
     </w:p>
     <w:p>
       <w:pPr>
-        <w:spacing w:after="40"/>
-      </w:pPr>
-      <w:r>
-        <w:rPr>
-          <w:b/>
-          <w:sz w:val="21"/>
-        </w:rPr>
-        <w:t>The store: a SharePoint List, one row per saved layout, on a shared SharePoint/Teams site.</w:t>
-      </w:r>
-    </w:p>
-    <w:p>
-      <w:pPr>
-        <w:spacing w:after="80"/>
+        <w:spacing w:after="60"/>
       </w:pPr>
       <w:r>
         <w:rPr>
           <w:b w:val="0"/>
           <w:sz w:val="21"/>
         </w:rPr>
-        <w:t>The app reads and writes it through the Microsoft Graph API using each person’s normal M365 sign-in. When one person saves, everyone gets it on next load. This is the durable form of "run it on our OneDrive."</w:t>
-      </w:r>
-    </w:p>
-    <w:p>
-      <w:pPr>
-        <w:spacing w:after="40"/>
-      </w:pPr>
-      <w:r>
-        <w:rPr>
-          <w:b w:val="0"/>
-          <w:sz w:val="21"/>
-        </w:rPr>
-        <w:t>Why a List and not a single JSON file on OneDrive: a shared file is unsafe. When two people save within a few seconds, OneDrive silently keeps a conflict copy (for example layouts-MARKS-PC.json) and one person’s edits disappear from the copy everyone else is reading. A SharePoint List, through Graph, gives:</w:t>
-      </w:r>
-    </w:p>
-    <w:p>
-      <w:pPr>
-        <w:pStyle w:val="ListBullet"/>
-        <w:spacing w:after="40"/>
-      </w:pPr>
-      <w:r>
-        <w:t>collisions only when two people edit the SAME layout, not the whole dataset;</w:t>
-      </w:r>
-    </w:p>
-    <w:p>
-      <w:pPr>
-        <w:pStyle w:val="ListBullet"/>
-        <w:spacing w:after="40"/>
-      </w:pPr>
-      <w:r>
-        <w:t>optimistic concurrency: a stale save is rejected (HTTP 412) so the app re-loads and warns instead of overwriting;</w:t>
-      </w:r>
-    </w:p>
-    <w:p>
-      <w:pPr>
-        <w:pStyle w:val="ListBullet"/>
-        <w:spacing w:after="40"/>
-      </w:pPr>
-      <w:r>
-        <w:t>per-item version history: who changed what, and when, built in. This mirrors the ECN/PCN change-control habit for free.</w:t>
-      </w:r>
-    </w:p>
-    <w:p>
-      <w:pPr>
-        <w:spacing w:after="40"/>
-      </w:pPr>
-      <w:r>
-        <w:rPr>
-          <w:b w:val="0"/>
-          <w:sz w:val="21"/>
-        </w:rPr>
-        <w:t>Two things to know up front, both confirmed:</w:t>
+        <w:t>Why a List and not a shared file on OneDrive: two near-simultaneous saves to a file produce a silent conflict copy and one person’s edits disappear. A List gives per-layout collisions only, rejection of stale saves (the app re-loads and warns instead of overwriting), and per-item version history: who changed what, when.</w:t>
       </w:r>
     </w:p>
     <w:p>
@@ -234,7 +228,7 @@
         <w:t>Hosting:</w:t>
       </w:r>
       <w:r>
-        <w:t xml:space="preserve"> The app is served from a static web address, not from the OneDrive folder. SharePoint serves a raw .html file as a download, and a double-clicked local file cannot sign in. Host the page on an internal web server, Azure Static Web Apps, or package it into SharePoint (SPFx). This is static hosting, not an application server to babysit. The data lives in M365; the app file is served from a URL.</w:t>
+        <w:t xml:space="preserve"> The app page is served from a static web address (internal web server, Azure Static Web Apps, or SharePoint SPFx). SharePoint hands a raw .html back as a download, so the page cannot live in the folder itself. Static hosting, not an application server.</w:t>
       </w:r>
     </w:p>
     <w:p>
@@ -249,19 +243,19 @@
         <w:t>Admin consent:</w:t>
       </w:r>
       <w:r>
-        <w:t xml:space="preserve"> To reach a shared location (not a user’s own OneDrive), an M365 admin grants a one-time tenant consent for the Graph permission (Sites.ReadWrite.All), plus a one-time Entra "SPA" app registration. About 15 minutes, once. After that, users just sign in.</w:t>
+        <w:t xml:space="preserve"> One-time Entra "SPA" app registration plus tenant admin consent for the Graph scope (Sites.ReadWrite.All). About 15 minutes, once.</w:t>
       </w:r>
     </w:p>
     <w:p>
       <w:pPr>
-        <w:spacing w:after="80"/>
+        <w:spacing w:after="60"/>
       </w:pPr>
       <w:r>
         <w:rPr>
           <w:b w:val="0"/>
           <w:sz w:val="21"/>
         </w:rPr>
-        <w:t>The code is already shaped for this swap: every read and write funnels through four functions (saveLayout, loadLayout, readLayouts, writeLayouts). Replacing localStorage with MSAL sign-in plus Graph calls is roughly one to two days of development.</w:t>
+        <w:t>The code funnels every read/write through four functions, so the localStorage-to-Graph swap is roughly one to two days of development.</w:t>
       </w:r>
     </w:p>
     <w:p>
@@ -273,19 +267,7 @@
           <w:b/>
           <w:sz w:val="21"/>
         </w:rPr>
-        <w:t>Interim bridge (this week, zero IT effort): declare one copy on the SharePoint/Teams site the only official copy. One owner makes changes, uses "Save into app," and republishes there. Everyone opens from that link, never a local copy. Manual, but it stops the forking today.</w:t>
-      </w:r>
-    </w:p>
-    <w:p>
-      <w:pPr>
-        <w:spacing w:after="120"/>
-      </w:pPr>
-      <w:r>
-        <w:rPr>
-          <w:b w:val="0"/>
-          <w:sz w:val="21"/>
-        </w:rPr>
-        <w:t>Ownership note: put it on a SharePoint/Teams site, not a person’s personal OneDrive. Everyone still perceives it as "our OneDrive," but it does not orphan if that person leaves.</w:t>
+        <w:t>Interim bridge (start now, zero IT): one official copy on the SharePoint/Teams site; one owner republishes it via "Save into app"; everyone opens from that link only. Use a Teams site, not a personal OneDrive, so nothing orphans.</w:t>
       </w:r>
     </w:p>
     <w:p>
@@ -298,7 +280,7 @@
           <w:color w:val="1D3A66"/>
           <w:sz w:val="28"/>
         </w:rPr>
-        <w:t>4 · Change control for the data</w:t>
+        <w:t>4 · Roles and permissions</w:t>
       </w:r>
     </w:p>
     <w:p>
@@ -310,10 +292,10 @@
         <w:rPr>
           <w:b/>
         </w:rPr>
-        <w:t>Sandbox vs Official</w:t>
+        <w:t>Admin (Engineering/CI)</w:t>
       </w:r>
       <w:r>
-        <w:t>: anyone experiments under their own name; only the named data owner publishes Official layouts/times.</w:t>
+        <w:t>: full app. Publishes Official layouts, times, products, coverage rules. Official time changes require an SWI behind them and update the measured-vs-estimated register in the same change.</w:t>
       </w:r>
     </w:p>
     <w:p>
@@ -325,10 +307,10 @@
         <w:rPr>
           <w:b/>
         </w:rPr>
-        <w:t>Times change with evidence</w:t>
+        <w:t>Floor manager</w:t>
       </w:r>
       <w:r>
-        <w:t>: official step times change only when a new or revised SWI backs them; the measured-vs-estimated register updates in the same change.</w:t>
+        <w:t>: Planner, Takt board, charts, product selection, day length and crew for the day. Cannot overwrite Official layouts.</w:t>
       </w:r>
     </w:p>
     <w:p>
@@ -340,10 +322,10 @@
         <w:rPr>
           <w:b/>
         </w:rPr>
-        <w:t>Change log</w:t>
+        <w:t>Enforcement, phased</w:t>
       </w:r>
       <w:r>
-        <w:t>: the SharePoint List version history records who changed what, and when, for every save.</w:t>
+        <w:t>: first by convention (Floor-tools toggle / two builds), later by role check on the M365 sign-in.</w:t>
       </w:r>
     </w:p>
     <w:p>
@@ -356,7 +338,7 @@
           <w:color w:val="1D3A66"/>
           <w:sz w:val="28"/>
         </w:rPr>
-        <w:t>5 · Handoff steps</w:t>
+        <w:t>5 · Handoff phases</w:t>
       </w:r>
     </w:p>
     <w:tbl>
@@ -374,33 +356,33 @@
       <w:tr>
         <w:tc>
           <w:tcPr>
-            <w:tcW w:type="dxa" w:w="432"/>
+            <w:tcW w:type="dxa" w:w="1296"/>
           </w:tcPr>
           <w:p>
             <w:r>
               <w:rPr>
                 <w:b/>
               </w:rPr>
-              <w:t>#</w:t>
+              <w:t>Phase</w:t>
             </w:r>
           </w:p>
         </w:tc>
         <w:tc>
           <w:tcPr>
-            <w:tcW w:type="dxa" w:w="6336"/>
+            <w:tcW w:type="dxa" w:w="5760"/>
           </w:tcPr>
           <w:p>
             <w:r>
               <w:rPr>
                 <w:b/>
               </w:rPr>
-              <w:t>Step</w:t>
+              <w:t>What happens</w:t>
             </w:r>
           </w:p>
         </w:tc>
         <w:tc>
           <w:tcPr>
-            <w:tcW w:type="dxa" w:w="1440"/>
+            <w:tcW w:type="dxa" w:w="1296"/>
           </w:tcPr>
           <w:p>
             <w:r>
@@ -413,7 +395,7 @@
         </w:tc>
         <w:tc>
           <w:tcPr>
-            <w:tcW w:type="dxa" w:w="1440"/>
+            <w:tcW w:type="dxa" w:w="1296"/>
           </w:tcPr>
           <w:p>
             <w:r>
@@ -428,69 +410,27 @@
       <w:tr>
         <w:tc>
           <w:tcPr>
-            <w:tcW w:type="dxa" w:w="432"/>
+            <w:tcW w:type="dxa" w:w="1296"/>
           </w:tcPr>
           <w:p>
             <w:r>
-              <w:t>1</w:t>
+              <w:t>0. Now</w:t>
             </w:r>
           </w:p>
         </w:tc>
         <w:tc>
           <w:tcPr>
-            <w:tcW w:type="dxa" w:w="6336"/>
+            <w:tcW w:type="dxa" w:w="5760"/>
           </w:tcPr>
           <w:p>
             <w:r>
-              <w:t>IT setup: create the SharePoint/Teams site and a "Layouts" List; register an Entra "SPA" app; admin-consent the Graph scope (Sites.ReadWrite.All)</w:t>
+              <w:t>Publish the official copy to the SharePoint/Teams site ("open from here only"); tag a v1 of the repo; list known assumptions</w:t>
             </w:r>
           </w:p>
         </w:tc>
         <w:tc>
           <w:tcPr>
-            <w:tcW w:type="dxa" w:w="1440"/>
-          </w:tcPr>
-          <w:p>
-            <w:r>
-              <w:t>CI + IT</w:t>
-            </w:r>
-          </w:p>
-        </w:tc>
-        <w:tc>
-          <w:tcPr>
-            <w:tcW w:type="dxa" w:w="1440"/>
-          </w:tcPr>
-          <w:p>
-            <w:r>
-              <w:t>~1/2 day</w:t>
-            </w:r>
-          </w:p>
-        </w:tc>
-      </w:tr>
-      <w:tr>
-        <w:tc>
-          <w:tcPr>
-            <w:tcW w:type="dxa" w:w="432"/>
-          </w:tcPr>
-          <w:p>
-            <w:r>
-              <w:t>2</w:t>
-            </w:r>
-          </w:p>
-        </w:tc>
-        <w:tc>
-          <w:tcPr>
-            <w:tcW w:type="dxa" w:w="6336"/>
-          </w:tcPr>
-          <w:p>
-            <w:r>
-              <w:t>Start the interim bridge now: publish the official copy to the site; announce "open from here only"</w:t>
-            </w:r>
-          </w:p>
-        </w:tc>
-        <w:tc>
-          <w:tcPr>
-            <w:tcW w:type="dxa" w:w="1440"/>
+            <w:tcW w:type="dxa" w:w="1296"/>
           </w:tcPr>
           <w:p>
             <w:r>
@@ -500,7 +440,7 @@
         </w:tc>
         <w:tc>
           <w:tcPr>
-            <w:tcW w:type="dxa" w:w="1440"/>
+            <w:tcW w:type="dxa" w:w="1296"/>
           </w:tcPr>
           <w:p>
             <w:r>
@@ -512,27 +452,27 @@
       <w:tr>
         <w:tc>
           <w:tcPr>
-            <w:tcW w:type="dxa" w:w="432"/>
+            <w:tcW w:type="dxa" w:w="1296"/>
           </w:tcPr>
           <w:p>
             <w:r>
-              <w:t>3</w:t>
+              <w:t>1. Storage</w:t>
             </w:r>
           </w:p>
         </w:tc>
         <w:tc>
           <w:tcPr>
-            <w:tcW w:type="dxa" w:w="6336"/>
+            <w:tcW w:type="dxa" w:w="5760"/>
           </w:tcPr>
           <w:p>
             <w:r>
-              <w:t>Transfer code into TUUCI GitHub org / IT-controlled repo with build README</w:t>
+              <w:t>IT setup (site, Layouts list, Entra SPA registration, admin consent); implement MSAL + Graph in the four storage functions; host on an internal HTTPS URL</w:t>
             </w:r>
           </w:p>
         </w:tc>
         <w:tc>
           <w:tcPr>
-            <w:tcW w:type="dxa" w:w="1440"/>
+            <w:tcW w:type="dxa" w:w="1296"/>
           </w:tcPr>
           <w:p>
             <w:r>
@@ -542,11 +482,11 @@
         </w:tc>
         <w:tc>
           <w:tcPr>
-            <w:tcW w:type="dxa" w:w="1440"/>
+            <w:tcW w:type="dxa" w:w="1296"/>
           </w:tcPr>
           <w:p>
             <w:r>
-              <w:t>1/2 day</w:t>
+              <w:t>2-3 days</w:t>
             </w:r>
           </w:p>
         </w:tc>
@@ -554,69 +494,27 @@
       <w:tr>
         <w:tc>
           <w:tcPr>
-            <w:tcW w:type="dxa" w:w="432"/>
+            <w:tcW w:type="dxa" w:w="1296"/>
           </w:tcPr>
           <w:p>
             <w:r>
-              <w:t>4</w:t>
+              <w:t>2. Pilot</w:t>
             </w:r>
           </w:p>
         </w:tc>
         <w:tc>
           <w:tcPr>
-            <w:tcW w:type="dxa" w:w="6336"/>
+            <w:tcW w:type="dxa" w:w="5760"/>
           </w:tcPr>
           <w:p>
             <w:r>
-              <w:t>Implement storage: MSAL sign-in + Graph read/write against the Layouts List (ETag concurrency); swap the four storage functions; host the page on an internal HTTPS URL</w:t>
+              <w:t>2-3 users run it for a week; verify saves propagate, nothing lost, numbers trusted</w:t>
             </w:r>
           </w:p>
         </w:tc>
         <w:tc>
           <w:tcPr>
-            <w:tcW w:type="dxa" w:w="1440"/>
-          </w:tcPr>
-          <w:p>
-            <w:r>
-              <w:t>Dev</w:t>
-            </w:r>
-          </w:p>
-        </w:tc>
-        <w:tc>
-          <w:tcPr>
-            <w:tcW w:type="dxa" w:w="1440"/>
-          </w:tcPr>
-          <w:p>
-            <w:r>
-              <w:t>1-2 days</w:t>
-            </w:r>
-          </w:p>
-        </w:tc>
-      </w:tr>
-      <w:tr>
-        <w:tc>
-          <w:tcPr>
-            <w:tcW w:type="dxa" w:w="432"/>
-          </w:tcPr>
-          <w:p>
-            <w:r>
-              <w:t>5</w:t>
-            </w:r>
-          </w:p>
-        </w:tc>
-        <w:tc>
-          <w:tcPr>
-            <w:tcW w:type="dxa" w:w="6336"/>
-          </w:tcPr>
-          <w:p>
-            <w:r>
-              <w:t>Pilot with 2-3 mezzanine users; verify saves propagate and nothing is lost</w:t>
-            </w:r>
-          </w:p>
-        </w:tc>
-        <w:tc>
-          <w:tcPr>
-            <w:tcW w:type="dxa" w:w="1440"/>
+            <w:tcW w:type="dxa" w:w="1296"/>
           </w:tcPr>
           <w:p>
             <w:r>
@@ -626,7 +524,7 @@
         </w:tc>
         <w:tc>
           <w:tcPr>
-            <w:tcW w:type="dxa" w:w="1440"/>
+            <w:tcW w:type="dxa" w:w="1296"/>
           </w:tcPr>
           <w:p>
             <w:r>
@@ -638,41 +536,41 @@
       <w:tr>
         <w:tc>
           <w:tcPr>
-            <w:tcW w:type="dxa" w:w="432"/>
+            <w:tcW w:type="dxa" w:w="1296"/>
           </w:tcPr>
           <w:p>
             <w:r>
-              <w:t>6</w:t>
+              <w:t>3. Roles</w:t>
             </w:r>
           </w:p>
         </w:tc>
         <w:tc>
           <w:tcPr>
-            <w:tcW w:type="dxa" w:w="6336"/>
+            <w:tcW w:type="dxa" w:w="5760"/>
           </w:tcPr>
           <w:p>
             <w:r>
-              <w:t>Name owners: technical owner (builds/deploys/hosts) and data owner (publishes Official)</w:t>
+              <w:t>Split admin vs floor-manager experience; train supervisors on Planner/Takt board only</w:t>
             </w:r>
           </w:p>
         </w:tc>
         <w:tc>
           <w:tcPr>
-            <w:tcW w:type="dxa" w:w="1440"/>
+            <w:tcW w:type="dxa" w:w="1296"/>
           </w:tcPr>
           <w:p>
             <w:r>
-              <w:t>Mgmt</w:t>
+              <w:t>CI + IT</w:t>
             </w:r>
           </w:p>
         </w:tc>
         <w:tc>
           <w:tcPr>
-            <w:tcW w:type="dxa" w:w="1440"/>
+            <w:tcW w:type="dxa" w:w="1296"/>
           </w:tcPr>
           <w:p>
             <w:r>
-              <w:t>.</w:t>
+              <w:t>2-3 days</w:t>
             </w:r>
           </w:p>
         </w:tc>
@@ -680,41 +578,41 @@
       <w:tr>
         <w:tc>
           <w:tcPr>
-            <w:tcW w:type="dxa" w:w="432"/>
+            <w:tcW w:type="dxa" w:w="1296"/>
           </w:tcPr>
           <w:p>
             <w:r>
-              <w:t>7</w:t>
+              <w:t>4. Ownership</w:t>
             </w:r>
           </w:p>
         </w:tc>
         <w:tc>
           <w:tcPr>
-            <w:tcW w:type="dxa" w:w="6336"/>
+            <w:tcW w:type="dxa" w:w="5760"/>
           </w:tcPr>
           <w:p>
             <w:r>
-              <w:t>Training: 1-hour session plus a one-page cheat sheet</w:t>
+              <w:t>Name technical owner and data owner; move repo into TUUCI’s org; training (1 hr supervisors, 2 hr admin) + cheat sheets</w:t>
             </w:r>
           </w:p>
         </w:tc>
         <w:tc>
           <w:tcPr>
-            <w:tcW w:type="dxa" w:w="1440"/>
+            <w:tcW w:type="dxa" w:w="1296"/>
           </w:tcPr>
           <w:p>
             <w:r>
-              <w:t>CI</w:t>
+              <w:t>Mgmt + CI</w:t>
             </w:r>
           </w:p>
         </w:tc>
         <w:tc>
           <w:tcPr>
-            <w:tcW w:type="dxa" w:w="1440"/>
+            <w:tcW w:type="dxa" w:w="1296"/>
           </w:tcPr>
           <w:p>
             <w:r>
-              <w:t>1/2 day prep</w:t>
+              <w:t>1/2 day + sessions</w:t>
             </w:r>
           </w:p>
         </w:tc>
@@ -722,27 +620,27 @@
       <w:tr>
         <w:tc>
           <w:tcPr>
-            <w:tcW w:type="dxa" w:w="432"/>
+            <w:tcW w:type="dxa" w:w="1296"/>
           </w:tcPr>
           <w:p>
             <w:r>
-              <w:t>8</w:t>
+              <w:t>5. Support</w:t>
             </w:r>
           </w:p>
         </w:tc>
         <w:tc>
           <w:tcPr>
-            <w:tcW w:type="dxa" w:w="6336"/>
+            <w:tcW w:type="dxa" w:w="5760"/>
           </w:tcPr>
           <w:p>
             <w:r>
-              <w:t>Support path plus keep the assumptions register current</w:t>
+              <w:t>Issues route to the data owner; assumptions register stays current; keep grounding times in real SWIs</w:t>
             </w:r>
           </w:p>
         </w:tc>
         <w:tc>
           <w:tcPr>
-            <w:tcW w:type="dxa" w:w="1440"/>
+            <w:tcW w:type="dxa" w:w="1296"/>
           </w:tcPr>
           <w:p>
             <w:r>
@@ -752,7 +650,7 @@
         </w:tc>
         <w:tc>
           <w:tcPr>
-            <w:tcW w:type="dxa" w:w="1440"/>
+            <w:tcW w:type="dxa" w:w="1296"/>
           </w:tcPr>
           <w:p>
             <w:r>
@@ -772,7 +670,7 @@
           <w:color w:val="1D3A66"/>
           <w:sz w:val="28"/>
         </w:rPr>
-        <w:t>6 · Open decisions for TUUCI</w:t>
+        <w:t>6 · Definition of done</w:t>
       </w:r>
     </w:p>
     <w:p>
@@ -781,7 +679,7 @@
         <w:spacing w:after="40"/>
       </w:pPr>
       <w:r>
-        <w:t>Where to host the app page: internal web server vs Azure Static Web Apps vs SharePoint (SPFx).</w:t>
+        <w:t>Data lives in the shared M365 store; a two-person concurrent-save test passes.</w:t>
       </w:r>
     </w:p>
     <w:p>
@@ -790,7 +688,7 @@
         <w:spacing w:after="40"/>
       </w:pPr>
       <w:r>
-        <w:t>Who does the one-time Entra app registration and admin consent.</w:t>
+        <w:t>Every official step time is SWI-measured or explicitly flagged as an estimate.</w:t>
       </w:r>
     </w:p>
     <w:p>
@@ -799,7 +697,65 @@
         <w:spacing w:after="40"/>
       </w:pPr>
       <w:r>
-        <w:t>Backup/retention of the Layouts List (SharePoint version history plus recycle bin, or an extra export).</w:t>
+        <w:t>Named technical owner and data owner have accepted the roles.</w:t>
+      </w:r>
+    </w:p>
+    <w:p>
+      <w:pPr>
+        <w:pStyle w:val="ListBullet"/>
+        <w:spacing w:after="40"/>
+      </w:pPr>
+      <w:r>
+        <w:t>Supervisors can run a day’s plan in the Planner without help.</w:t>
+      </w:r>
+    </w:p>
+    <w:p>
+      <w:pPr>
+        <w:pStyle w:val="ListBullet"/>
+        <w:spacing w:after="40"/>
+      </w:pPr>
+      <w:r>
+        <w:t>Repo, build instructions, and theming script live in a TUUCI-controlled repository.</w:t>
+      </w:r>
+    </w:p>
+    <w:p>
+      <w:pPr>
+        <w:spacing w:before="200" w:after="60"/>
+      </w:pPr>
+      <w:r>
+        <w:rPr>
+          <w:b/>
+          <w:color w:val="1D3A66"/>
+          <w:sz w:val="28"/>
+        </w:rPr>
+        <w:t>7 · Open decisions for TUUCI</w:t>
+      </w:r>
+    </w:p>
+    <w:p>
+      <w:pPr>
+        <w:pStyle w:val="ListBullet"/>
+        <w:spacing w:after="40"/>
+      </w:pPr>
+      <w:r>
+        <w:t>App hosting: internal web server vs Azure Static Web Apps vs SharePoint (SPFx).</w:t>
+      </w:r>
+    </w:p>
+    <w:p>
+      <w:pPr>
+        <w:pStyle w:val="ListBullet"/>
+        <w:spacing w:after="40"/>
+      </w:pPr>
+      <w:r>
+        <w:t>Who performs the Entra app registration and admin consent.</w:t>
+      </w:r>
+    </w:p>
+    <w:p>
+      <w:pPr>
+        <w:pStyle w:val="ListBullet"/>
+        <w:spacing w:after="40"/>
+      </w:pPr>
+      <w:r>
+        <w:t>Backup/retention of the Layouts list beyond version history.</w:t>
       </w:r>
     </w:p>
     <w:p>
@@ -809,6 +765,15 @@
       </w:pPr>
       <w:r>
         <w:t>Named technical owner and data owner.</w:t>
+      </w:r>
+    </w:p>
+    <w:p>
+      <w:pPr>
+        <w:pStyle w:val="ListBullet"/>
+        <w:spacing w:after="40"/>
+      </w:pPr>
+      <w:r>
+        <w:t>Whether the TUUCI-branded skin becomes the primary look (recommended).</w:t>
       </w:r>
     </w:p>
     <w:sectPr>

</xml_diff>